<commit_message>
chore: Assignment 2 added.
</commit_message>
<xml_diff>
--- a/Design and Analysis of Algorithms (CS2009)/Assignments/Assignment-2/Assignment 2.docx
+++ b/Design and Analysis of Algorithms (CS2009)/Assignments/Assignment-2/Assignment 2.docx
@@ -454,6 +454,463 @@
         </w:rPr>
         <w:t>Question 5:</w:t>
       </w:r>
+    </w:p>
+    <w:p>
+      <w:pPr>
+        <w:bidi w:val="0"/>
+        <w:spacing w:before="240" w:beforeAutospacing="off" w:after="240" w:afterAutospacing="off"/>
+        <w:jc w:val="left"/>
+        <w:rPr>
+          <w:rFonts w:ascii="Times New Roman" w:hAnsi="Times New Roman" w:eastAsia="Times New Roman" w:cs="Times New Roman"/>
+          <w:noProof w:val="0"/>
+          <w:sz w:val="24"/>
+          <w:szCs w:val="24"/>
+          <w:lang w:val="en-US"/>
+        </w:rPr>
+      </w:pPr>
+      <w:r>
+        <w:rPr>
+          <w:rFonts w:ascii="Times New Roman" w:hAnsi="Times New Roman" w:eastAsia="Times New Roman" w:cs="Times New Roman"/>
+          <w:b w:val="1"/>
+          <w:bCs w:val="1"/>
+          <w:noProof w:val="0"/>
+          <w:sz w:val="24"/>
+          <w:szCs w:val="24"/>
+          <w:lang w:val="en-US"/>
+        </w:rPr>
+        <w:t>Base Cases:</w:t>
+      </w:r>
+      <w:r>
+        <w:rPr>
+          <w:rFonts w:ascii="Times New Roman" w:hAnsi="Times New Roman" w:eastAsia="Times New Roman" w:cs="Times New Roman"/>
+          <w:noProof w:val="0"/>
+          <w:sz w:val="24"/>
+          <w:szCs w:val="24"/>
+          <w:lang w:val="en-US"/>
+        </w:rPr>
+        <w:t xml:space="preserve"> The function returns 0 if there are no items left (</w:t>
+      </w:r>
+      <w:r>
+        <w:rPr>
+          <w:rFonts w:ascii="Times New Roman" w:hAnsi="Times New Roman" w:eastAsia="Times New Roman" w:cs="Times New Roman"/>
+          <w:noProof w:val="0"/>
+          <w:sz w:val="24"/>
+          <w:szCs w:val="24"/>
+          <w:lang w:val="en-US"/>
+        </w:rPr>
+        <w:t>i</w:t>
+      </w:r>
+      <w:r>
+        <w:rPr>
+          <w:rFonts w:ascii="Times New Roman" w:hAnsi="Times New Roman" w:eastAsia="Times New Roman" w:cs="Times New Roman"/>
+          <w:noProof w:val="0"/>
+          <w:sz w:val="24"/>
+          <w:szCs w:val="24"/>
+          <w:lang w:val="en-US"/>
+        </w:rPr>
+        <w:t xml:space="preserve"> &gt; N) or no capacity left (</w:t>
+      </w:r>
+      <w:r>
+        <w:rPr>
+          <w:rFonts w:ascii="Times New Roman" w:hAnsi="Times New Roman" w:eastAsia="Times New Roman" w:cs="Times New Roman"/>
+          <w:noProof w:val="0"/>
+          <w:sz w:val="24"/>
+          <w:szCs w:val="24"/>
+          <w:lang w:val="en-US"/>
+        </w:rPr>
+        <w:t>remainingWeight</w:t>
+      </w:r>
+      <w:r>
+        <w:rPr>
+          <w:rFonts w:ascii="Times New Roman" w:hAnsi="Times New Roman" w:eastAsia="Times New Roman" w:cs="Times New Roman"/>
+          <w:noProof w:val="0"/>
+          <w:sz w:val="24"/>
+          <w:szCs w:val="24"/>
+          <w:lang w:val="en-US"/>
+        </w:rPr>
+        <w:t xml:space="preserve"> == 0).</w:t>
+      </w:r>
+    </w:p>
+    <w:p>
+      <w:pPr>
+        <w:bidi w:val="0"/>
+        <w:spacing w:before="240" w:beforeAutospacing="off" w:after="240" w:afterAutospacing="off"/>
+        <w:jc w:val="left"/>
+        <w:rPr>
+          <w:rFonts w:ascii="Times New Roman" w:hAnsi="Times New Roman" w:eastAsia="Times New Roman" w:cs="Times New Roman"/>
+          <w:noProof w:val="0"/>
+          <w:sz w:val="24"/>
+          <w:szCs w:val="24"/>
+          <w:lang w:val="en-US"/>
+        </w:rPr>
+      </w:pPr>
+      <w:r>
+        <w:rPr>
+          <w:rFonts w:ascii="Times New Roman" w:hAnsi="Times New Roman" w:eastAsia="Times New Roman" w:cs="Times New Roman"/>
+          <w:b w:val="1"/>
+          <w:bCs w:val="1"/>
+          <w:noProof w:val="0"/>
+          <w:sz w:val="24"/>
+          <w:szCs w:val="24"/>
+          <w:lang w:val="en-US"/>
+        </w:rPr>
+        <w:t>Recurrence:</w:t>
+      </w:r>
+      <w:r>
+        <w:rPr>
+          <w:rFonts w:ascii="Times New Roman" w:hAnsi="Times New Roman" w:eastAsia="Times New Roman" w:cs="Times New Roman"/>
+          <w:noProof w:val="0"/>
+          <w:sz w:val="24"/>
+          <w:szCs w:val="24"/>
+          <w:lang w:val="en-US"/>
+        </w:rPr>
+        <w:t xml:space="preserve"> For any item </w:t>
+      </w:r>
+      <w:r>
+        <w:rPr>
+          <w:rFonts w:ascii="Times New Roman" w:hAnsi="Times New Roman" w:eastAsia="Times New Roman" w:cs="Times New Roman"/>
+          <w:noProof w:val="0"/>
+          <w:sz w:val="24"/>
+          <w:szCs w:val="24"/>
+          <w:lang w:val="en-US"/>
+        </w:rPr>
+        <w:t>i</w:t>
+      </w:r>
+      <w:r>
+        <w:rPr>
+          <w:rFonts w:ascii="Times New Roman" w:hAnsi="Times New Roman" w:eastAsia="Times New Roman" w:cs="Times New Roman"/>
+          <w:noProof w:val="0"/>
+          <w:sz w:val="24"/>
+          <w:szCs w:val="24"/>
+          <w:lang w:val="en-US"/>
+        </w:rPr>
+        <w:t xml:space="preserve">, the max value </w:t>
+      </w:r>
+      <w:r>
+        <w:rPr>
+          <w:rFonts w:ascii="Times New Roman" w:hAnsi="Times New Roman" w:eastAsia="Times New Roman" w:cs="Times New Roman"/>
+          <w:noProof w:val="0"/>
+          <w:sz w:val="24"/>
+          <w:szCs w:val="24"/>
+          <w:lang w:val="en-US"/>
+        </w:rPr>
+        <w:t>f(</w:t>
+      </w:r>
+      <w:r>
+        <w:rPr>
+          <w:rFonts w:ascii="Times New Roman" w:hAnsi="Times New Roman" w:eastAsia="Times New Roman" w:cs="Times New Roman"/>
+          <w:noProof w:val="0"/>
+          <w:sz w:val="24"/>
+          <w:szCs w:val="24"/>
+          <w:lang w:val="en-US"/>
+        </w:rPr>
+        <w:t>i</w:t>
+      </w:r>
+      <w:r>
+        <w:rPr>
+          <w:rFonts w:ascii="Times New Roman" w:hAnsi="Times New Roman" w:eastAsia="Times New Roman" w:cs="Times New Roman"/>
+          <w:noProof w:val="0"/>
+          <w:sz w:val="24"/>
+          <w:szCs w:val="24"/>
+          <w:lang w:val="en-US"/>
+        </w:rPr>
+        <w:t xml:space="preserve">, </w:t>
+      </w:r>
+      <w:r>
+        <w:rPr>
+          <w:rFonts w:ascii="Times New Roman" w:hAnsi="Times New Roman" w:eastAsia="Times New Roman" w:cs="Times New Roman"/>
+          <w:noProof w:val="0"/>
+          <w:sz w:val="24"/>
+          <w:szCs w:val="24"/>
+          <w:lang w:val="en-US"/>
+        </w:rPr>
+        <w:t>remainingWeight</w:t>
+      </w:r>
+      <w:r>
+        <w:rPr>
+          <w:rFonts w:ascii="Times New Roman" w:hAnsi="Times New Roman" w:eastAsia="Times New Roman" w:cs="Times New Roman"/>
+          <w:noProof w:val="0"/>
+          <w:sz w:val="24"/>
+          <w:szCs w:val="24"/>
+          <w:lang w:val="en-US"/>
+        </w:rPr>
+        <w:t>) is the greater of two choices:</w:t>
+      </w:r>
+    </w:p>
+    <w:p>
+      <w:pPr>
+        <w:pStyle w:val="ListParagraph"/>
+        <w:numPr>
+          <w:ilvl w:val="0"/>
+          <w:numId w:val="1"/>
+        </w:numPr>
+        <w:bidi w:val="0"/>
+        <w:spacing w:before="0" w:beforeAutospacing="off" w:after="0" w:afterAutospacing="off"/>
+        <w:jc w:val="left"/>
+        <w:rPr>
+          <w:rFonts w:ascii="Times New Roman" w:hAnsi="Times New Roman" w:eastAsia="Times New Roman" w:cs="Times New Roman"/>
+          <w:noProof w:val="0"/>
+          <w:sz w:val="24"/>
+          <w:szCs w:val="24"/>
+          <w:lang w:val="en-US"/>
+        </w:rPr>
+      </w:pPr>
+      <w:r>
+        <w:rPr>
+          <w:rFonts w:ascii="Times New Roman" w:hAnsi="Times New Roman" w:eastAsia="Times New Roman" w:cs="Times New Roman"/>
+          <w:b w:val="1"/>
+          <w:bCs w:val="1"/>
+          <w:noProof w:val="0"/>
+          <w:sz w:val="24"/>
+          <w:szCs w:val="24"/>
+          <w:lang w:val="en-US"/>
+        </w:rPr>
+        <w:t xml:space="preserve">Skip item </w:t>
+      </w:r>
+      <w:r>
+        <w:rPr>
+          <w:rFonts w:ascii="Times New Roman" w:hAnsi="Times New Roman" w:eastAsia="Times New Roman" w:cs="Times New Roman"/>
+          <w:b w:val="1"/>
+          <w:bCs w:val="1"/>
+          <w:noProof w:val="0"/>
+          <w:sz w:val="24"/>
+          <w:szCs w:val="24"/>
+          <w:lang w:val="en-US"/>
+        </w:rPr>
+        <w:t>i</w:t>
+      </w:r>
+      <w:r>
+        <w:rPr>
+          <w:rFonts w:ascii="Times New Roman" w:hAnsi="Times New Roman" w:eastAsia="Times New Roman" w:cs="Times New Roman"/>
+          <w:b w:val="1"/>
+          <w:bCs w:val="1"/>
+          <w:noProof w:val="0"/>
+          <w:sz w:val="24"/>
+          <w:szCs w:val="24"/>
+          <w:lang w:val="en-US"/>
+        </w:rPr>
+        <w:t>:</w:t>
+      </w:r>
+      <w:r>
+        <w:rPr>
+          <w:rFonts w:ascii="Times New Roman" w:hAnsi="Times New Roman" w:eastAsia="Times New Roman" w:cs="Times New Roman"/>
+          <w:noProof w:val="0"/>
+          <w:sz w:val="24"/>
+          <w:szCs w:val="24"/>
+          <w:lang w:val="en-US"/>
+        </w:rPr>
+        <w:t xml:space="preserve"> </w:t>
+      </w:r>
+      <w:r>
+        <w:rPr>
+          <w:rFonts w:ascii="Times New Roman" w:hAnsi="Times New Roman" w:eastAsia="Times New Roman" w:cs="Times New Roman"/>
+          <w:noProof w:val="0"/>
+          <w:sz w:val="24"/>
+          <w:szCs w:val="24"/>
+          <w:lang w:val="en-US"/>
+        </w:rPr>
+        <w:t>f(</w:t>
+      </w:r>
+      <w:r>
+        <w:rPr>
+          <w:rFonts w:ascii="Times New Roman" w:hAnsi="Times New Roman" w:eastAsia="Times New Roman" w:cs="Times New Roman"/>
+          <w:noProof w:val="0"/>
+          <w:sz w:val="24"/>
+          <w:szCs w:val="24"/>
+          <w:lang w:val="en-US"/>
+        </w:rPr>
+        <w:t>i</w:t>
+      </w:r>
+      <w:r>
+        <w:rPr>
+          <w:rFonts w:ascii="Times New Roman" w:hAnsi="Times New Roman" w:eastAsia="Times New Roman" w:cs="Times New Roman"/>
+          <w:noProof w:val="0"/>
+          <w:sz w:val="24"/>
+          <w:szCs w:val="24"/>
+          <w:lang w:val="en-US"/>
+        </w:rPr>
+        <w:t xml:space="preserve"> + 1, </w:t>
+      </w:r>
+      <w:r>
+        <w:rPr>
+          <w:rFonts w:ascii="Times New Roman" w:hAnsi="Times New Roman" w:eastAsia="Times New Roman" w:cs="Times New Roman"/>
+          <w:noProof w:val="0"/>
+          <w:sz w:val="24"/>
+          <w:szCs w:val="24"/>
+          <w:lang w:val="en-US"/>
+        </w:rPr>
+        <w:t>remainingWeight</w:t>
+      </w:r>
+      <w:r>
+        <w:rPr>
+          <w:rFonts w:ascii="Times New Roman" w:hAnsi="Times New Roman" w:eastAsia="Times New Roman" w:cs="Times New Roman"/>
+          <w:noProof w:val="0"/>
+          <w:sz w:val="24"/>
+          <w:szCs w:val="24"/>
+          <w:lang w:val="en-US"/>
+        </w:rPr>
+        <w:t>)</w:t>
+      </w:r>
+    </w:p>
+    <w:p>
+      <w:pPr>
+        <w:pStyle w:val="ListParagraph"/>
+        <w:numPr>
+          <w:ilvl w:val="0"/>
+          <w:numId w:val="1"/>
+        </w:numPr>
+        <w:bidi w:val="0"/>
+        <w:spacing w:before="0" w:beforeAutospacing="off" w:after="0" w:afterAutospacing="off"/>
+        <w:jc w:val="left"/>
+        <w:rPr>
+          <w:rFonts w:ascii="Times New Roman" w:hAnsi="Times New Roman" w:eastAsia="Times New Roman" w:cs="Times New Roman"/>
+          <w:noProof w:val="0"/>
+          <w:sz w:val="24"/>
+          <w:szCs w:val="24"/>
+          <w:lang w:val="en-US"/>
+        </w:rPr>
+      </w:pPr>
+      <w:r>
+        <w:rPr>
+          <w:rFonts w:ascii="Times New Roman" w:hAnsi="Times New Roman" w:eastAsia="Times New Roman" w:cs="Times New Roman"/>
+          <w:b w:val="1"/>
+          <w:bCs w:val="1"/>
+          <w:noProof w:val="0"/>
+          <w:sz w:val="24"/>
+          <w:szCs w:val="24"/>
+          <w:lang w:val="en-US"/>
+        </w:rPr>
+        <w:t xml:space="preserve">Take item </w:t>
+      </w:r>
+      <w:r>
+        <w:rPr>
+          <w:rFonts w:ascii="Times New Roman" w:hAnsi="Times New Roman" w:eastAsia="Times New Roman" w:cs="Times New Roman"/>
+          <w:b w:val="1"/>
+          <w:bCs w:val="1"/>
+          <w:noProof w:val="0"/>
+          <w:sz w:val="24"/>
+          <w:szCs w:val="24"/>
+          <w:lang w:val="en-US"/>
+        </w:rPr>
+        <w:t>i</w:t>
+      </w:r>
+      <w:r>
+        <w:rPr>
+          <w:rFonts w:ascii="Times New Roman" w:hAnsi="Times New Roman" w:eastAsia="Times New Roman" w:cs="Times New Roman"/>
+          <w:noProof w:val="0"/>
+          <w:sz w:val="24"/>
+          <w:szCs w:val="24"/>
+          <w:lang w:val="en-US"/>
+        </w:rPr>
+        <w:t xml:space="preserve"> (if it fits): v[</w:t>
+      </w:r>
+      <w:r>
+        <w:rPr>
+          <w:rFonts w:ascii="Times New Roman" w:hAnsi="Times New Roman" w:eastAsia="Times New Roman" w:cs="Times New Roman"/>
+          <w:noProof w:val="0"/>
+          <w:sz w:val="24"/>
+          <w:szCs w:val="24"/>
+          <w:lang w:val="en-US"/>
+        </w:rPr>
+        <w:t>i</w:t>
+      </w:r>
+      <w:r>
+        <w:rPr>
+          <w:rFonts w:ascii="Times New Roman" w:hAnsi="Times New Roman" w:eastAsia="Times New Roman" w:cs="Times New Roman"/>
+          <w:noProof w:val="0"/>
+          <w:sz w:val="24"/>
+          <w:szCs w:val="24"/>
+          <w:lang w:val="en-US"/>
+        </w:rPr>
+        <w:t xml:space="preserve">] + </w:t>
+      </w:r>
+      <w:r>
+        <w:rPr>
+          <w:rFonts w:ascii="Times New Roman" w:hAnsi="Times New Roman" w:eastAsia="Times New Roman" w:cs="Times New Roman"/>
+          <w:noProof w:val="0"/>
+          <w:sz w:val="24"/>
+          <w:szCs w:val="24"/>
+          <w:lang w:val="en-US"/>
+        </w:rPr>
+        <w:t>f(</w:t>
+      </w:r>
+      <w:r>
+        <w:rPr>
+          <w:rFonts w:ascii="Times New Roman" w:hAnsi="Times New Roman" w:eastAsia="Times New Roman" w:cs="Times New Roman"/>
+          <w:noProof w:val="0"/>
+          <w:sz w:val="24"/>
+          <w:szCs w:val="24"/>
+          <w:lang w:val="en-US"/>
+        </w:rPr>
+        <w:t>i</w:t>
+      </w:r>
+      <w:r>
+        <w:rPr>
+          <w:rFonts w:ascii="Times New Roman" w:hAnsi="Times New Roman" w:eastAsia="Times New Roman" w:cs="Times New Roman"/>
+          <w:noProof w:val="0"/>
+          <w:sz w:val="24"/>
+          <w:szCs w:val="24"/>
+          <w:lang w:val="en-US"/>
+        </w:rPr>
+        <w:t xml:space="preserve"> + 1, </w:t>
+      </w:r>
+      <w:r>
+        <w:rPr>
+          <w:rFonts w:ascii="Times New Roman" w:hAnsi="Times New Roman" w:eastAsia="Times New Roman" w:cs="Times New Roman"/>
+          <w:noProof w:val="0"/>
+          <w:sz w:val="24"/>
+          <w:szCs w:val="24"/>
+          <w:lang w:val="en-US"/>
+        </w:rPr>
+        <w:t>remainingWeight</w:t>
+      </w:r>
+      <w:r>
+        <w:rPr>
+          <w:rFonts w:ascii="Times New Roman" w:hAnsi="Times New Roman" w:eastAsia="Times New Roman" w:cs="Times New Roman"/>
+          <w:noProof w:val="0"/>
+          <w:sz w:val="24"/>
+          <w:szCs w:val="24"/>
+          <w:lang w:val="en-US"/>
+        </w:rPr>
+        <w:t xml:space="preserve"> - w[</w:t>
+      </w:r>
+      <w:r>
+        <w:rPr>
+          <w:rFonts w:ascii="Times New Roman" w:hAnsi="Times New Roman" w:eastAsia="Times New Roman" w:cs="Times New Roman"/>
+          <w:noProof w:val="0"/>
+          <w:sz w:val="24"/>
+          <w:szCs w:val="24"/>
+          <w:lang w:val="en-US"/>
+        </w:rPr>
+        <w:t>i</w:t>
+      </w:r>
+      <w:r>
+        <w:rPr>
+          <w:rFonts w:ascii="Times New Roman" w:hAnsi="Times New Roman" w:eastAsia="Times New Roman" w:cs="Times New Roman"/>
+          <w:noProof w:val="0"/>
+          <w:sz w:val="24"/>
+          <w:szCs w:val="24"/>
+          <w:lang w:val="en-US"/>
+        </w:rPr>
+        <w:t>])</w:t>
+      </w:r>
+    </w:p>
+    <w:p>
+      <w:pPr>
+        <w:pStyle w:val="Normal"/>
+        <w:suppressLineNumbers w:val="0"/>
+        <w:bidi w:val="0"/>
+        <w:spacing w:before="0" w:beforeAutospacing="off" w:after="160" w:afterAutospacing="off" w:line="279" w:lineRule="auto"/>
+        <w:ind w:left="0" w:right="0"/>
+        <w:jc w:val="left"/>
+        <w:rPr>
+          <w:rFonts w:ascii="Times New Roman" w:hAnsi="Times New Roman" w:eastAsia="Times New Roman" w:cs="Times New Roman"/>
+          <w:b w:val="1"/>
+          <w:bCs w:val="1"/>
+          <w:sz w:val="28"/>
+          <w:szCs w:val="28"/>
+        </w:rPr>
+      </w:pPr>
     </w:p>
     <w:tbl>
       <w:tblPr>
@@ -1767,6 +2224,218 @@
     </w:p>
     <w:p>
       <w:pPr>
+        <w:bidi w:val="0"/>
+        <w:spacing w:before="0" w:beforeAutospacing="off" w:after="240" w:afterAutospacing="off"/>
+        <w:jc w:val="left"/>
+        <w:rPr>
+          <w:rFonts w:ascii="Times New Roman" w:hAnsi="Times New Roman" w:eastAsia="Times New Roman" w:cs="Times New Roman"/>
+          <w:noProof w:val="0"/>
+          <w:sz w:val="24"/>
+          <w:szCs w:val="24"/>
+          <w:lang w:val="en-US"/>
+        </w:rPr>
+      </w:pPr>
+      <w:r>
+        <w:rPr>
+          <w:rFonts w:ascii="Times New Roman" w:hAnsi="Times New Roman" w:eastAsia="Times New Roman" w:cs="Times New Roman"/>
+          <w:noProof w:val="0"/>
+          <w:sz w:val="24"/>
+          <w:szCs w:val="24"/>
+          <w:lang w:val="en-US"/>
+        </w:rPr>
+        <w:t xml:space="preserve">State Meaning: </w:t>
+      </w:r>
+      <w:r>
+        <w:rPr>
+          <w:rFonts w:ascii="Times New Roman" w:hAnsi="Times New Roman" w:eastAsia="Times New Roman" w:cs="Times New Roman"/>
+          <w:noProof w:val="0"/>
+          <w:sz w:val="24"/>
+          <w:szCs w:val="24"/>
+          <w:lang w:val="en-US"/>
+        </w:rPr>
+        <w:t>f(</w:t>
+      </w:r>
+      <w:r>
+        <w:rPr>
+          <w:rFonts w:ascii="Times New Roman" w:hAnsi="Times New Roman" w:eastAsia="Times New Roman" w:cs="Times New Roman"/>
+          <w:noProof w:val="0"/>
+          <w:sz w:val="24"/>
+          <w:szCs w:val="24"/>
+          <w:lang w:val="en-US"/>
+        </w:rPr>
+        <w:t xml:space="preserve">pos, tight, </w:t>
+      </w:r>
+      <w:r>
+        <w:rPr>
+          <w:rFonts w:ascii="Times New Roman" w:hAnsi="Times New Roman" w:eastAsia="Times New Roman" w:cs="Times New Roman"/>
+          <w:noProof w:val="0"/>
+          <w:sz w:val="24"/>
+          <w:szCs w:val="24"/>
+          <w:lang w:val="en-US"/>
+        </w:rPr>
+        <w:t>leading_zeros</w:t>
+      </w:r>
+      <w:r>
+        <w:rPr>
+          <w:rFonts w:ascii="Times New Roman" w:hAnsi="Times New Roman" w:eastAsia="Times New Roman" w:cs="Times New Roman"/>
+          <w:noProof w:val="0"/>
+          <w:sz w:val="24"/>
+          <w:szCs w:val="24"/>
+          <w:lang w:val="en-US"/>
+        </w:rPr>
+        <w:t xml:space="preserve">) counts valid number suffixes (no 4 or 9) that can be formed from pos, where tight tracks if </w:t>
+      </w:r>
+      <w:r>
+        <w:rPr>
+          <w:rFonts w:ascii="Times New Roman" w:hAnsi="Times New Roman" w:eastAsia="Times New Roman" w:cs="Times New Roman"/>
+          <w:noProof w:val="0"/>
+          <w:sz w:val="24"/>
+          <w:szCs w:val="24"/>
+          <w:lang w:val="en-US"/>
+        </w:rPr>
+        <w:t>we're</w:t>
+      </w:r>
+      <w:r>
+        <w:rPr>
+          <w:rFonts w:ascii="Times New Roman" w:hAnsi="Times New Roman" w:eastAsia="Times New Roman" w:cs="Times New Roman"/>
+          <w:noProof w:val="0"/>
+          <w:sz w:val="24"/>
+          <w:szCs w:val="24"/>
+          <w:lang w:val="en-US"/>
+        </w:rPr>
+        <w:t xml:space="preserve"> restricted by the upper bound's digit and </w:t>
+      </w:r>
+      <w:r>
+        <w:rPr>
+          <w:rFonts w:ascii="Times New Roman" w:hAnsi="Times New Roman" w:eastAsia="Times New Roman" w:cs="Times New Roman"/>
+          <w:noProof w:val="0"/>
+          <w:sz w:val="24"/>
+          <w:szCs w:val="24"/>
+          <w:lang w:val="en-US"/>
+        </w:rPr>
+        <w:t>leading_zeros</w:t>
+      </w:r>
+      <w:r>
+        <w:rPr>
+          <w:rFonts w:ascii="Times New Roman" w:hAnsi="Times New Roman" w:eastAsia="Times New Roman" w:cs="Times New Roman"/>
+          <w:noProof w:val="0"/>
+          <w:sz w:val="24"/>
+          <w:szCs w:val="24"/>
+          <w:lang w:val="en-US"/>
+        </w:rPr>
+        <w:t xml:space="preserve"> tracks if </w:t>
+      </w:r>
+      <w:r>
+        <w:rPr>
+          <w:rFonts w:ascii="Times New Roman" w:hAnsi="Times New Roman" w:eastAsia="Times New Roman" w:cs="Times New Roman"/>
+          <w:noProof w:val="0"/>
+          <w:sz w:val="24"/>
+          <w:szCs w:val="24"/>
+          <w:lang w:val="en-US"/>
+        </w:rPr>
+        <w:t>we're</w:t>
+      </w:r>
+      <w:r>
+        <w:rPr>
+          <w:rFonts w:ascii="Times New Roman" w:hAnsi="Times New Roman" w:eastAsia="Times New Roman" w:cs="Times New Roman"/>
+          <w:noProof w:val="0"/>
+          <w:sz w:val="24"/>
+          <w:szCs w:val="24"/>
+          <w:lang w:val="en-US"/>
+        </w:rPr>
+        <w:t xml:space="preserve"> still at the start.</w:t>
+      </w:r>
+    </w:p>
+    <w:p>
+      <w:pPr>
+        <w:bidi w:val="0"/>
+        <w:spacing w:before="240" w:beforeAutospacing="off" w:after="240" w:afterAutospacing="off"/>
+        <w:jc w:val="left"/>
+        <w:rPr>
+          <w:rFonts w:ascii="Times New Roman" w:hAnsi="Times New Roman" w:eastAsia="Times New Roman" w:cs="Times New Roman"/>
+          <w:noProof w:val="0"/>
+          <w:sz w:val="24"/>
+          <w:szCs w:val="24"/>
+          <w:lang w:val="en-US"/>
+        </w:rPr>
+      </w:pPr>
+      <w:r>
+        <w:rPr>
+          <w:rFonts w:ascii="Times New Roman" w:hAnsi="Times New Roman" w:eastAsia="Times New Roman" w:cs="Times New Roman"/>
+          <w:noProof w:val="0"/>
+          <w:sz w:val="24"/>
+          <w:szCs w:val="24"/>
+          <w:lang w:val="en-US"/>
+        </w:rPr>
+        <w:t xml:space="preserve">Base Case: If </w:t>
+      </w:r>
+      <w:r>
+        <w:rPr>
+          <w:rFonts w:ascii="Times New Roman" w:hAnsi="Times New Roman" w:eastAsia="Times New Roman" w:cs="Times New Roman"/>
+          <w:noProof w:val="0"/>
+          <w:sz w:val="24"/>
+          <w:szCs w:val="24"/>
+          <w:lang w:val="en-US"/>
+        </w:rPr>
+        <w:t>pos</w:t>
+      </w:r>
+      <w:r>
+        <w:rPr>
+          <w:rFonts w:ascii="Times New Roman" w:hAnsi="Times New Roman" w:eastAsia="Times New Roman" w:cs="Times New Roman"/>
+          <w:noProof w:val="0"/>
+          <w:sz w:val="24"/>
+          <w:szCs w:val="24"/>
+          <w:lang w:val="en-US"/>
+        </w:rPr>
+        <w:t xml:space="preserve"> reaches the end of the number, return 1 (we successfully formed one valid number).</w:t>
+      </w:r>
+    </w:p>
+    <w:p>
+      <w:pPr>
+        <w:bidi w:val="0"/>
+        <w:spacing w:before="240" w:beforeAutospacing="off" w:after="240" w:afterAutospacing="off"/>
+        <w:jc w:val="left"/>
+        <w:rPr>
+          <w:rFonts w:ascii="Times New Roman" w:hAnsi="Times New Roman" w:eastAsia="Times New Roman" w:cs="Times New Roman"/>
+          <w:noProof w:val="0"/>
+          <w:sz w:val="24"/>
+          <w:szCs w:val="24"/>
+          <w:lang w:val="en-US"/>
+        </w:rPr>
+      </w:pPr>
+      <w:r>
+        <w:rPr>
+          <w:rFonts w:ascii="Times New Roman" w:hAnsi="Times New Roman" w:eastAsia="Times New Roman" w:cs="Times New Roman"/>
+          <w:noProof w:val="0"/>
+          <w:sz w:val="24"/>
+          <w:szCs w:val="24"/>
+          <w:lang w:val="en-US"/>
+        </w:rPr>
+        <w:t xml:space="preserve">Recurrence: Sum the results of </w:t>
+      </w:r>
+      <w:r>
+        <w:rPr>
+          <w:rFonts w:ascii="Times New Roman" w:hAnsi="Times New Roman" w:eastAsia="Times New Roman" w:cs="Times New Roman"/>
+          <w:noProof w:val="0"/>
+          <w:sz w:val="24"/>
+          <w:szCs w:val="24"/>
+          <w:lang w:val="en-US"/>
+        </w:rPr>
+        <w:t>f(</w:t>
+      </w:r>
+      <w:r>
+        <w:rPr>
+          <w:rFonts w:ascii="Times New Roman" w:hAnsi="Times New Roman" w:eastAsia="Times New Roman" w:cs="Times New Roman"/>
+          <w:noProof w:val="0"/>
+          <w:sz w:val="24"/>
+          <w:szCs w:val="24"/>
+          <w:lang w:val="en-US"/>
+        </w:rPr>
+        <w:t>pos + 1, ...) for every digit (from 0 to a limit) that is not 4 or 9, where limit is N[pos] if tight is true, otherwise 9.</w:t>
+      </w:r>
+    </w:p>
+    <w:p>
+      <w:pPr>
         <w:pStyle w:val="Normal"/>
         <w:suppressLineNumbers w:val="0"/>
         <w:bidi w:val="0"/>
@@ -2358,7 +3027,7 @@
         <w:t>Total Valid Numbers = Total Numbers - Total Invalid Numbers Total Valid Numbers = 50−18=32</w:t>
       </w:r>
     </w:p>
-    <w:p>
+    <w:p w14:noSpellErr="1">
       <w:pPr>
         <w:pStyle w:val="Normal"/>
         <w:jc w:val="left"/>
@@ -2383,7 +3052,11 @@
           <w:szCs w:val="28"/>
         </w:rPr>
       </w:pPr>
-      <w:r>
+    </w:p>
+    <w:p>
+      <w:pPr>
+        <w:pStyle w:val="Normal"/>
+        <w:jc w:val="left"/>
         <w:rPr>
           <w:rFonts w:ascii="Times New Roman" w:hAnsi="Times New Roman" w:eastAsia="Times New Roman" w:cs="Times New Roman"/>
           <w:b w:val="1"/>
@@ -2391,8 +3064,454 @@
           <w:sz w:val="28"/>
           <w:szCs w:val="28"/>
         </w:rPr>
+      </w:pPr>
+    </w:p>
+    <w:p>
+      <w:pPr>
+        <w:pStyle w:val="Normal"/>
+        <w:jc w:val="left"/>
+        <w:rPr>
+          <w:rFonts w:ascii="Times New Roman" w:hAnsi="Times New Roman" w:eastAsia="Times New Roman" w:cs="Times New Roman"/>
+          <w:b w:val="1"/>
+          <w:bCs w:val="1"/>
+          <w:sz w:val="28"/>
+          <w:szCs w:val="28"/>
+        </w:rPr>
+      </w:pPr>
+    </w:p>
+    <w:p w14:noSpellErr="1">
+      <w:pPr>
+        <w:pStyle w:val="Normal"/>
+        <w:jc w:val="left"/>
+        <w:rPr>
+          <w:rFonts w:ascii="Times New Roman" w:hAnsi="Times New Roman" w:eastAsia="Times New Roman" w:cs="Times New Roman"/>
+          <w:b w:val="1"/>
+          <w:bCs w:val="1"/>
+          <w:sz w:val="24"/>
+          <w:szCs w:val="24"/>
+        </w:rPr>
+      </w:pPr>
+      <w:r>
+        <w:rPr>
+          <w:rFonts w:ascii="Times New Roman" w:hAnsi="Times New Roman" w:eastAsia="Times New Roman" w:cs="Times New Roman"/>
+          <w:b w:val="1"/>
+          <w:bCs w:val="1"/>
+          <w:sz w:val="28"/>
+          <w:szCs w:val="28"/>
+        </w:rPr>
         <w:t>Question 7:</w:t>
       </w:r>
+    </w:p>
+    <w:p>
+      <w:pPr>
+        <w:pStyle w:val="ListParagraph"/>
+        <w:numPr>
+          <w:ilvl w:val="0"/>
+          <w:numId w:val="2"/>
+        </w:numPr>
+        <w:spacing w:before="0" w:beforeAutospacing="off" w:after="0" w:afterAutospacing="off"/>
+        <w:jc w:val="left"/>
+        <w:rPr>
+          <w:rFonts w:ascii="Times New Roman" w:hAnsi="Times New Roman" w:eastAsia="Times New Roman" w:cs="Times New Roman"/>
+          <w:noProof w:val="0"/>
+          <w:sz w:val="24"/>
+          <w:szCs w:val="24"/>
+          <w:lang w:val="en-US"/>
+        </w:rPr>
+      </w:pPr>
+      <w:r>
+        <w:rPr>
+          <w:rFonts w:ascii="Times New Roman" w:hAnsi="Times New Roman" w:eastAsia="Times New Roman" w:cs="Times New Roman"/>
+          <w:noProof w:val="0"/>
+          <w:sz w:val="24"/>
+          <w:szCs w:val="24"/>
+          <w:lang w:val="en-US"/>
+        </w:rPr>
+        <w:t>Recurrence and Transitions</w:t>
+      </w:r>
+    </w:p>
+    <w:p>
+      <w:pPr>
+        <w:spacing w:before="240" w:beforeAutospacing="off" w:after="240" w:afterAutospacing="off"/>
+        <w:jc w:val="left"/>
+        <w:rPr>
+          <w:rFonts w:ascii="Times New Roman" w:hAnsi="Times New Roman" w:eastAsia="Times New Roman" w:cs="Times New Roman"/>
+          <w:noProof w:val="0"/>
+          <w:sz w:val="24"/>
+          <w:szCs w:val="24"/>
+          <w:lang w:val="en-US"/>
+        </w:rPr>
+      </w:pPr>
+      <w:r>
+        <w:rPr>
+          <w:rFonts w:ascii="Times New Roman" w:hAnsi="Times New Roman" w:eastAsia="Times New Roman" w:cs="Times New Roman"/>
+          <w:noProof w:val="0"/>
+          <w:sz w:val="24"/>
+          <w:szCs w:val="24"/>
+          <w:lang w:val="en-US"/>
+        </w:rPr>
+        <w:t xml:space="preserve">Base Case: If pos == </w:t>
+      </w:r>
+      <w:r>
+        <w:rPr>
+          <w:rFonts w:ascii="Times New Roman" w:hAnsi="Times New Roman" w:eastAsia="Times New Roman" w:cs="Times New Roman"/>
+          <w:noProof w:val="0"/>
+          <w:sz w:val="24"/>
+          <w:szCs w:val="24"/>
+          <w:lang w:val="en-US"/>
+        </w:rPr>
+        <w:t>s.length</w:t>
+      </w:r>
+      <w:r>
+        <w:rPr>
+          <w:rFonts w:ascii="Times New Roman" w:hAnsi="Times New Roman" w:eastAsia="Times New Roman" w:cs="Times New Roman"/>
+          <w:noProof w:val="0"/>
+          <w:sz w:val="24"/>
+          <w:szCs w:val="24"/>
+          <w:lang w:val="en-US"/>
+        </w:rPr>
+        <w:t xml:space="preserve">(), we have finished the number. Return 1 if </w:t>
+      </w:r>
+      <w:r>
+        <w:rPr>
+          <w:rFonts w:ascii="Times New Roman" w:hAnsi="Times New Roman" w:eastAsia="Times New Roman" w:cs="Times New Roman"/>
+          <w:noProof w:val="0"/>
+          <w:sz w:val="24"/>
+          <w:szCs w:val="24"/>
+          <w:lang w:val="en-US"/>
+        </w:rPr>
+        <w:t>sumMod</w:t>
+      </w:r>
+      <w:r>
+        <w:rPr>
+          <w:rFonts w:ascii="Times New Roman" w:hAnsi="Times New Roman" w:eastAsia="Times New Roman" w:cs="Times New Roman"/>
+          <w:noProof w:val="0"/>
+          <w:sz w:val="24"/>
+          <w:szCs w:val="24"/>
+          <w:lang w:val="en-US"/>
+        </w:rPr>
+        <w:t xml:space="preserve"> == 0 (the sum is divisible by K), otherwise return 0.</w:t>
+      </w:r>
+    </w:p>
+    <w:p>
+      <w:pPr>
+        <w:spacing w:before="240" w:beforeAutospacing="off" w:after="240" w:afterAutospacing="off"/>
+        <w:jc w:val="left"/>
+        <w:rPr>
+          <w:rFonts w:ascii="Times New Roman" w:hAnsi="Times New Roman" w:eastAsia="Times New Roman" w:cs="Times New Roman"/>
+          <w:noProof w:val="0"/>
+          <w:sz w:val="24"/>
+          <w:szCs w:val="24"/>
+          <w:lang w:val="en-US"/>
+        </w:rPr>
+      </w:pPr>
+      <w:r>
+        <w:rPr>
+          <w:rFonts w:ascii="Times New Roman" w:hAnsi="Times New Roman" w:eastAsia="Times New Roman" w:cs="Times New Roman"/>
+          <w:noProof w:val="0"/>
+          <w:sz w:val="24"/>
+          <w:szCs w:val="24"/>
+          <w:lang w:val="en-US"/>
+        </w:rPr>
+        <w:t xml:space="preserve">Recurrence: We </w:t>
+      </w:r>
+      <w:r>
+        <w:rPr>
+          <w:rFonts w:ascii="Times New Roman" w:hAnsi="Times New Roman" w:eastAsia="Times New Roman" w:cs="Times New Roman"/>
+          <w:noProof w:val="0"/>
+          <w:sz w:val="24"/>
+          <w:szCs w:val="24"/>
+          <w:lang w:val="en-US"/>
+        </w:rPr>
+        <w:t>sum</w:t>
+      </w:r>
+      <w:r>
+        <w:rPr>
+          <w:rFonts w:ascii="Times New Roman" w:hAnsi="Times New Roman" w:eastAsia="Times New Roman" w:cs="Times New Roman"/>
+          <w:noProof w:val="0"/>
+          <w:sz w:val="24"/>
+          <w:szCs w:val="24"/>
+          <w:lang w:val="en-US"/>
+        </w:rPr>
+        <w:t xml:space="preserve"> the results of all valid next states. We loop digit from 0 to a limit (where limit is s[pos] if tight is true, else 9) and add the result of f(pos + 1, </w:t>
+      </w:r>
+      <w:r>
+        <w:rPr>
+          <w:rFonts w:ascii="Times New Roman" w:hAnsi="Times New Roman" w:eastAsia="Times New Roman" w:cs="Times New Roman"/>
+          <w:noProof w:val="0"/>
+          <w:sz w:val="24"/>
+          <w:szCs w:val="24"/>
+          <w:lang w:val="en-US"/>
+        </w:rPr>
+        <w:t>new_sumMod</w:t>
+      </w:r>
+      <w:r>
+        <w:rPr>
+          <w:rFonts w:ascii="Times New Roman" w:hAnsi="Times New Roman" w:eastAsia="Times New Roman" w:cs="Times New Roman"/>
+          <w:noProof w:val="0"/>
+          <w:sz w:val="24"/>
+          <w:szCs w:val="24"/>
+          <w:lang w:val="en-US"/>
+        </w:rPr>
+        <w:t xml:space="preserve">, </w:t>
+      </w:r>
+      <w:r>
+        <w:rPr>
+          <w:rFonts w:ascii="Times New Roman" w:hAnsi="Times New Roman" w:eastAsia="Times New Roman" w:cs="Times New Roman"/>
+          <w:noProof w:val="0"/>
+          <w:sz w:val="24"/>
+          <w:szCs w:val="24"/>
+          <w:lang w:val="en-US"/>
+        </w:rPr>
+        <w:t>new_tight</w:t>
+      </w:r>
+      <w:r>
+        <w:rPr>
+          <w:rFonts w:ascii="Times New Roman" w:hAnsi="Times New Roman" w:eastAsia="Times New Roman" w:cs="Times New Roman"/>
+          <w:noProof w:val="0"/>
+          <w:sz w:val="24"/>
+          <w:szCs w:val="24"/>
+          <w:lang w:val="en-US"/>
+        </w:rPr>
+        <w:t xml:space="preserve">), where the transitions are </w:t>
+      </w:r>
+      <w:r>
+        <w:rPr>
+          <w:rFonts w:ascii="Times New Roman" w:hAnsi="Times New Roman" w:eastAsia="Times New Roman" w:cs="Times New Roman"/>
+          <w:noProof w:val="0"/>
+          <w:sz w:val="24"/>
+          <w:szCs w:val="24"/>
+          <w:lang w:val="en-US"/>
+        </w:rPr>
+        <w:t>new_sumMod</w:t>
+      </w:r>
+      <w:r>
+        <w:rPr>
+          <w:rFonts w:ascii="Times New Roman" w:hAnsi="Times New Roman" w:eastAsia="Times New Roman" w:cs="Times New Roman"/>
+          <w:noProof w:val="0"/>
+          <w:sz w:val="24"/>
+          <w:szCs w:val="24"/>
+          <w:lang w:val="en-US"/>
+        </w:rPr>
+        <w:t xml:space="preserve"> = (</w:t>
+      </w:r>
+      <w:r>
+        <w:rPr>
+          <w:rFonts w:ascii="Times New Roman" w:hAnsi="Times New Roman" w:eastAsia="Times New Roman" w:cs="Times New Roman"/>
+          <w:noProof w:val="0"/>
+          <w:sz w:val="24"/>
+          <w:szCs w:val="24"/>
+          <w:lang w:val="en-US"/>
+        </w:rPr>
+        <w:t>sumMod</w:t>
+      </w:r>
+      <w:r>
+        <w:rPr>
+          <w:rFonts w:ascii="Times New Roman" w:hAnsi="Times New Roman" w:eastAsia="Times New Roman" w:cs="Times New Roman"/>
+          <w:noProof w:val="0"/>
+          <w:sz w:val="24"/>
+          <w:szCs w:val="24"/>
+          <w:lang w:val="en-US"/>
+        </w:rPr>
+        <w:t xml:space="preserve"> + digit) % K and </w:t>
+      </w:r>
+      <w:r>
+        <w:rPr>
+          <w:rFonts w:ascii="Times New Roman" w:hAnsi="Times New Roman" w:eastAsia="Times New Roman" w:cs="Times New Roman"/>
+          <w:noProof w:val="0"/>
+          <w:sz w:val="24"/>
+          <w:szCs w:val="24"/>
+          <w:lang w:val="en-US"/>
+        </w:rPr>
+        <w:t>new_tight</w:t>
+      </w:r>
+      <w:r>
+        <w:rPr>
+          <w:rFonts w:ascii="Times New Roman" w:hAnsi="Times New Roman" w:eastAsia="Times New Roman" w:cs="Times New Roman"/>
+          <w:noProof w:val="0"/>
+          <w:sz w:val="24"/>
+          <w:szCs w:val="24"/>
+          <w:lang w:val="en-US"/>
+        </w:rPr>
+        <w:t xml:space="preserve"> = tight &amp;&amp; (digit == limit).</w:t>
+      </w:r>
+    </w:p>
+    <w:p>
+      <w:pPr>
+        <w:pStyle w:val="ListParagraph"/>
+        <w:numPr>
+          <w:ilvl w:val="0"/>
+          <w:numId w:val="3"/>
+        </w:numPr>
+        <w:spacing w:before="0" w:beforeAutospacing="off" w:after="0" w:afterAutospacing="off"/>
+        <w:jc w:val="left"/>
+        <w:rPr>
+          <w:rFonts w:ascii="Times New Roman" w:hAnsi="Times New Roman" w:eastAsia="Times New Roman" w:cs="Times New Roman"/>
+          <w:noProof w:val="0"/>
+          <w:sz w:val="24"/>
+          <w:szCs w:val="24"/>
+          <w:lang w:val="en-US"/>
+        </w:rPr>
+      </w:pPr>
+      <w:r>
+        <w:rPr>
+          <w:rFonts w:ascii="Times New Roman" w:hAnsi="Times New Roman" w:eastAsia="Times New Roman" w:cs="Times New Roman"/>
+          <w:noProof w:val="0"/>
+          <w:sz w:val="24"/>
+          <w:szCs w:val="24"/>
+          <w:lang w:val="en-US"/>
+        </w:rPr>
+        <w:t>How Memoization Avoids Recomputation</w:t>
+      </w:r>
+    </w:p>
+    <w:p>
+      <w:pPr>
+        <w:spacing w:before="240" w:beforeAutospacing="off" w:after="240" w:afterAutospacing="off"/>
+        <w:jc w:val="left"/>
+      </w:pPr>
+      <w:r>
+        <w:rPr>
+          <w:rFonts w:ascii="Times New Roman" w:hAnsi="Times New Roman" w:eastAsia="Times New Roman" w:cs="Times New Roman"/>
+          <w:noProof w:val="0"/>
+          <w:sz w:val="24"/>
+          <w:szCs w:val="24"/>
+          <w:lang w:val="en-US"/>
+        </w:rPr>
+        <w:t xml:space="preserve">We use a 3D array, </w:t>
+      </w:r>
+      <w:r>
+        <w:rPr>
+          <w:rFonts w:ascii="Times New Roman" w:hAnsi="Times New Roman" w:eastAsia="Times New Roman" w:cs="Times New Roman"/>
+          <w:noProof w:val="0"/>
+          <w:sz w:val="24"/>
+          <w:szCs w:val="24"/>
+          <w:lang w:val="en-US"/>
+        </w:rPr>
+        <w:t>dp</w:t>
+      </w:r>
+      <w:r>
+        <w:rPr>
+          <w:rFonts w:ascii="Times New Roman" w:hAnsi="Times New Roman" w:eastAsia="Times New Roman" w:cs="Times New Roman"/>
+          <w:noProof w:val="0"/>
+          <w:sz w:val="24"/>
+          <w:szCs w:val="24"/>
+          <w:lang w:val="en-US"/>
+        </w:rPr>
+        <w:t>[pos][</w:t>
+      </w:r>
+      <w:r>
+        <w:rPr>
+          <w:rFonts w:ascii="Times New Roman" w:hAnsi="Times New Roman" w:eastAsia="Times New Roman" w:cs="Times New Roman"/>
+          <w:noProof w:val="0"/>
+          <w:sz w:val="24"/>
+          <w:szCs w:val="24"/>
+          <w:lang w:val="en-US"/>
+        </w:rPr>
+        <w:t>sumMod</w:t>
+      </w:r>
+      <w:r>
+        <w:rPr>
+          <w:rFonts w:ascii="Times New Roman" w:hAnsi="Times New Roman" w:eastAsia="Times New Roman" w:cs="Times New Roman"/>
+          <w:noProof w:val="0"/>
+          <w:sz w:val="24"/>
+          <w:szCs w:val="24"/>
+          <w:lang w:val="en-US"/>
+        </w:rPr>
+        <w:t xml:space="preserve">][tight], to store the result of each state. Different prefixes (e.g., "1, 2" vs "3, 0") can lead to the exact same subproblem (e.g., </w:t>
+      </w:r>
+      <w:r>
+        <w:rPr>
+          <w:rFonts w:ascii="Times New Roman" w:hAnsi="Times New Roman" w:eastAsia="Times New Roman" w:cs="Times New Roman"/>
+          <w:noProof w:val="0"/>
+          <w:sz w:val="24"/>
+          <w:szCs w:val="24"/>
+          <w:lang w:val="en-US"/>
+        </w:rPr>
+        <w:t>f(</w:t>
+      </w:r>
+      <w:r>
+        <w:rPr>
+          <w:rFonts w:ascii="Times New Roman" w:hAnsi="Times New Roman" w:eastAsia="Times New Roman" w:cs="Times New Roman"/>
+          <w:noProof w:val="0"/>
+          <w:sz w:val="24"/>
+          <w:szCs w:val="24"/>
+          <w:lang w:val="en-US"/>
+        </w:rPr>
+        <w:t xml:space="preserve">pos=2, </w:t>
+      </w:r>
+      <w:r>
+        <w:rPr>
+          <w:rFonts w:ascii="Times New Roman" w:hAnsi="Times New Roman" w:eastAsia="Times New Roman" w:cs="Times New Roman"/>
+          <w:noProof w:val="0"/>
+          <w:sz w:val="24"/>
+          <w:szCs w:val="24"/>
+          <w:lang w:val="en-US"/>
+        </w:rPr>
+        <w:t>sumMod</w:t>
+      </w:r>
+      <w:r>
+        <w:rPr>
+          <w:rFonts w:ascii="Times New Roman" w:hAnsi="Times New Roman" w:eastAsia="Times New Roman" w:cs="Times New Roman"/>
+          <w:noProof w:val="0"/>
+          <w:sz w:val="24"/>
+          <w:szCs w:val="24"/>
+          <w:lang w:val="en-US"/>
+        </w:rPr>
+        <w:t xml:space="preserve">=3, tight=false)). </w:t>
+      </w:r>
+      <w:r>
+        <w:rPr>
+          <w:rFonts w:ascii="Times New Roman" w:hAnsi="Times New Roman" w:eastAsia="Times New Roman" w:cs="Times New Roman"/>
+          <w:noProof w:val="0"/>
+          <w:sz w:val="24"/>
+          <w:szCs w:val="24"/>
+          <w:lang w:val="en-US"/>
+        </w:rPr>
+        <w:t>Memoization</w:t>
+      </w:r>
+      <w:r>
+        <w:rPr>
+          <w:rFonts w:ascii="Times New Roman" w:hAnsi="Times New Roman" w:eastAsia="Times New Roman" w:cs="Times New Roman"/>
+          <w:noProof w:val="0"/>
+          <w:sz w:val="24"/>
+          <w:szCs w:val="24"/>
+          <w:lang w:val="en-US"/>
+        </w:rPr>
+        <w:t xml:space="preserve"> computes this common state once, saves the answer, and instantly returns the saved value on all </w:t>
+      </w:r>
+      <w:r>
+        <w:rPr>
+          <w:rFonts w:ascii="Times New Roman" w:hAnsi="Times New Roman" w:eastAsia="Times New Roman" w:cs="Times New Roman"/>
+          <w:noProof w:val="0"/>
+          <w:sz w:val="24"/>
+          <w:szCs w:val="24"/>
+          <w:lang w:val="en-US"/>
+        </w:rPr>
+        <w:t>subsequent</w:t>
+      </w:r>
+      <w:r>
+        <w:rPr>
+          <w:rFonts w:ascii="Times New Roman" w:hAnsi="Times New Roman" w:eastAsia="Times New Roman" w:cs="Times New Roman"/>
+          <w:noProof w:val="0"/>
+          <w:sz w:val="24"/>
+          <w:szCs w:val="24"/>
+          <w:lang w:val="en-US"/>
+        </w:rPr>
+        <w:t xml:space="preserve"> calls, avoiding redundant work.</w:t>
+      </w:r>
+    </w:p>
+    <w:p>
+      <w:pPr>
+        <w:spacing w:before="240" w:beforeAutospacing="off" w:after="240" w:afterAutospacing="off"/>
+        <w:jc w:val="left"/>
+        <w:rPr>
+          <w:rFonts w:ascii="Times New Roman" w:hAnsi="Times New Roman" w:eastAsia="Times New Roman" w:cs="Times New Roman"/>
+          <w:noProof w:val="0"/>
+          <w:sz w:val="24"/>
+          <w:szCs w:val="24"/>
+          <w:lang w:val="en-US"/>
+        </w:rPr>
+      </w:pPr>
     </w:p>
     <w:p>
       <w:pPr>
@@ -3401,6 +4520,275 @@
     </w:sectPr>
   </w:body>
 </w:document>
+</file>
+
+<file path=word/numbering.xml><?xml version="1.0" encoding="utf-8"?>
+<w:numbering xmlns:w="http://schemas.openxmlformats.org/wordprocessingml/2006/main">
+  <w:abstractNum xmlns:w="http://schemas.openxmlformats.org/wordprocessingml/2006/main" w:abstractNumId="3">
+    <w:nsid w:val="78141a8c"/>
+    <w:multiLevelType xmlns:w="http://schemas.openxmlformats.org/wordprocessingml/2006/main" w:val="hybridMultilevel"/>
+    <w:lvl xmlns:w="http://schemas.openxmlformats.org/wordprocessingml/2006/main" w:ilvl="0">
+      <w:start w:val="3"/>
+      <w:numFmt w:val="decimal"/>
+      <w:lvlText w:val="%1."/>
+      <w:lvlJc w:val="left"/>
+      <w:pPr>
+        <w:ind w:left="720" w:hanging="360"/>
+      </w:pPr>
+    </w:lvl>
+    <w:lvl xmlns:w="http://schemas.openxmlformats.org/wordprocessingml/2006/main" w:ilvl="1">
+      <w:start w:val="1"/>
+      <w:numFmt w:val="lowerLetter"/>
+      <w:lvlText w:val="%2."/>
+      <w:lvlJc w:val="left"/>
+      <w:pPr>
+        <w:ind w:left="1440" w:hanging="360"/>
+      </w:pPr>
+    </w:lvl>
+    <w:lvl xmlns:w="http://schemas.openxmlformats.org/wordprocessingml/2006/main" w:ilvl="2">
+      <w:start w:val="1"/>
+      <w:numFmt w:val="lowerRoman"/>
+      <w:lvlText w:val="%3."/>
+      <w:lvlJc w:val="right"/>
+      <w:pPr>
+        <w:ind w:left="2160" w:hanging="180"/>
+      </w:pPr>
+    </w:lvl>
+    <w:lvl xmlns:w="http://schemas.openxmlformats.org/wordprocessingml/2006/main" w:ilvl="3">
+      <w:start w:val="1"/>
+      <w:numFmt w:val="decimal"/>
+      <w:lvlText w:val="%4."/>
+      <w:lvlJc w:val="left"/>
+      <w:pPr>
+        <w:ind w:left="2880" w:hanging="360"/>
+      </w:pPr>
+    </w:lvl>
+    <w:lvl xmlns:w="http://schemas.openxmlformats.org/wordprocessingml/2006/main" w:ilvl="4">
+      <w:start w:val="1"/>
+      <w:numFmt w:val="lowerLetter"/>
+      <w:lvlText w:val="%5."/>
+      <w:lvlJc w:val="left"/>
+      <w:pPr>
+        <w:ind w:left="3600" w:hanging="360"/>
+      </w:pPr>
+    </w:lvl>
+    <w:lvl xmlns:w="http://schemas.openxmlformats.org/wordprocessingml/2006/main" w:ilvl="5">
+      <w:start w:val="1"/>
+      <w:numFmt w:val="lowerRoman"/>
+      <w:lvlText w:val="%6."/>
+      <w:lvlJc w:val="right"/>
+      <w:pPr>
+        <w:ind w:left="4320" w:hanging="180"/>
+      </w:pPr>
+    </w:lvl>
+    <w:lvl xmlns:w="http://schemas.openxmlformats.org/wordprocessingml/2006/main" w:ilvl="6">
+      <w:start w:val="1"/>
+      <w:numFmt w:val="decimal"/>
+      <w:lvlText w:val="%7."/>
+      <w:lvlJc w:val="left"/>
+      <w:pPr>
+        <w:ind w:left="5040" w:hanging="360"/>
+      </w:pPr>
+    </w:lvl>
+    <w:lvl xmlns:w="http://schemas.openxmlformats.org/wordprocessingml/2006/main" w:ilvl="7">
+      <w:start w:val="1"/>
+      <w:numFmt w:val="lowerLetter"/>
+      <w:lvlText w:val="%8."/>
+      <w:lvlJc w:val="left"/>
+      <w:pPr>
+        <w:ind w:left="5760" w:hanging="360"/>
+      </w:pPr>
+    </w:lvl>
+    <w:lvl xmlns:w="http://schemas.openxmlformats.org/wordprocessingml/2006/main" w:ilvl="8">
+      <w:start w:val="1"/>
+      <w:numFmt w:val="lowerRoman"/>
+      <w:lvlText w:val="%9."/>
+      <w:lvlJc w:val="right"/>
+      <w:pPr>
+        <w:ind w:left="6480" w:hanging="180"/>
+      </w:pPr>
+    </w:lvl>
+  </w:abstractNum>
+  <w:abstractNum xmlns:w="http://schemas.openxmlformats.org/wordprocessingml/2006/main" w:abstractNumId="2">
+    <w:nsid w:val="25ef779c"/>
+    <w:multiLevelType xmlns:w="http://schemas.openxmlformats.org/wordprocessingml/2006/main" w:val="hybridMultilevel"/>
+    <w:lvl xmlns:w="http://schemas.openxmlformats.org/wordprocessingml/2006/main" w:ilvl="0">
+      <w:start w:val="2"/>
+      <w:numFmt w:val="decimal"/>
+      <w:lvlText w:val="%1."/>
+      <w:lvlJc w:val="left"/>
+      <w:pPr>
+        <w:ind w:left="720" w:hanging="360"/>
+      </w:pPr>
+    </w:lvl>
+    <w:lvl xmlns:w="http://schemas.openxmlformats.org/wordprocessingml/2006/main" w:ilvl="1">
+      <w:start w:val="1"/>
+      <w:numFmt w:val="lowerLetter"/>
+      <w:lvlText w:val="%2."/>
+      <w:lvlJc w:val="left"/>
+      <w:pPr>
+        <w:ind w:left="1440" w:hanging="360"/>
+      </w:pPr>
+    </w:lvl>
+    <w:lvl xmlns:w="http://schemas.openxmlformats.org/wordprocessingml/2006/main" w:ilvl="2">
+      <w:start w:val="1"/>
+      <w:numFmt w:val="lowerRoman"/>
+      <w:lvlText w:val="%3."/>
+      <w:lvlJc w:val="right"/>
+      <w:pPr>
+        <w:ind w:left="2160" w:hanging="180"/>
+      </w:pPr>
+    </w:lvl>
+    <w:lvl xmlns:w="http://schemas.openxmlformats.org/wordprocessingml/2006/main" w:ilvl="3">
+      <w:start w:val="1"/>
+      <w:numFmt w:val="decimal"/>
+      <w:lvlText w:val="%4."/>
+      <w:lvlJc w:val="left"/>
+      <w:pPr>
+        <w:ind w:left="2880" w:hanging="360"/>
+      </w:pPr>
+    </w:lvl>
+    <w:lvl xmlns:w="http://schemas.openxmlformats.org/wordprocessingml/2006/main" w:ilvl="4">
+      <w:start w:val="1"/>
+      <w:numFmt w:val="lowerLetter"/>
+      <w:lvlText w:val="%5."/>
+      <w:lvlJc w:val="left"/>
+      <w:pPr>
+        <w:ind w:left="3600" w:hanging="360"/>
+      </w:pPr>
+    </w:lvl>
+    <w:lvl xmlns:w="http://schemas.openxmlformats.org/wordprocessingml/2006/main" w:ilvl="5">
+      <w:start w:val="1"/>
+      <w:numFmt w:val="lowerRoman"/>
+      <w:lvlText w:val="%6."/>
+      <w:lvlJc w:val="right"/>
+      <w:pPr>
+        <w:ind w:left="4320" w:hanging="180"/>
+      </w:pPr>
+    </w:lvl>
+    <w:lvl xmlns:w="http://schemas.openxmlformats.org/wordprocessingml/2006/main" w:ilvl="6">
+      <w:start w:val="1"/>
+      <w:numFmt w:val="decimal"/>
+      <w:lvlText w:val="%7."/>
+      <w:lvlJc w:val="left"/>
+      <w:pPr>
+        <w:ind w:left="5040" w:hanging="360"/>
+      </w:pPr>
+    </w:lvl>
+    <w:lvl xmlns:w="http://schemas.openxmlformats.org/wordprocessingml/2006/main" w:ilvl="7">
+      <w:start w:val="1"/>
+      <w:numFmt w:val="lowerLetter"/>
+      <w:lvlText w:val="%8."/>
+      <w:lvlJc w:val="left"/>
+      <w:pPr>
+        <w:ind w:left="5760" w:hanging="360"/>
+      </w:pPr>
+    </w:lvl>
+    <w:lvl xmlns:w="http://schemas.openxmlformats.org/wordprocessingml/2006/main" w:ilvl="8">
+      <w:start w:val="1"/>
+      <w:numFmt w:val="lowerRoman"/>
+      <w:lvlText w:val="%9."/>
+      <w:lvlJc w:val="right"/>
+      <w:pPr>
+        <w:ind w:left="6480" w:hanging="180"/>
+      </w:pPr>
+    </w:lvl>
+  </w:abstractNum>
+  <w:abstractNum xmlns:w="http://schemas.openxmlformats.org/wordprocessingml/2006/main" w:abstractNumId="1">
+    <w:nsid w:val="b05bdc5"/>
+    <w:multiLevelType xmlns:w="http://schemas.openxmlformats.org/wordprocessingml/2006/main" w:val="hybridMultilevel"/>
+    <w:lvl xmlns:w="http://schemas.openxmlformats.org/wordprocessingml/2006/main" w:ilvl="0">
+      <w:start w:val="1"/>
+      <w:numFmt w:val="decimal"/>
+      <w:lvlText w:val="%1."/>
+      <w:lvlJc w:val="left"/>
+      <w:pPr>
+        <w:ind w:left="720" w:hanging="360"/>
+      </w:pPr>
+    </w:lvl>
+    <w:lvl xmlns:w="http://schemas.openxmlformats.org/wordprocessingml/2006/main" w:ilvl="1">
+      <w:start w:val="1"/>
+      <w:numFmt w:val="lowerLetter"/>
+      <w:lvlText w:val="%2."/>
+      <w:lvlJc w:val="left"/>
+      <w:pPr>
+        <w:ind w:left="1440" w:hanging="360"/>
+      </w:pPr>
+    </w:lvl>
+    <w:lvl xmlns:w="http://schemas.openxmlformats.org/wordprocessingml/2006/main" w:ilvl="2">
+      <w:start w:val="1"/>
+      <w:numFmt w:val="lowerRoman"/>
+      <w:lvlText w:val="%3."/>
+      <w:lvlJc w:val="right"/>
+      <w:pPr>
+        <w:ind w:left="2160" w:hanging="180"/>
+      </w:pPr>
+    </w:lvl>
+    <w:lvl xmlns:w="http://schemas.openxmlformats.org/wordprocessingml/2006/main" w:ilvl="3">
+      <w:start w:val="1"/>
+      <w:numFmt w:val="decimal"/>
+      <w:lvlText w:val="%4."/>
+      <w:lvlJc w:val="left"/>
+      <w:pPr>
+        <w:ind w:left="2880" w:hanging="360"/>
+      </w:pPr>
+    </w:lvl>
+    <w:lvl xmlns:w="http://schemas.openxmlformats.org/wordprocessingml/2006/main" w:ilvl="4">
+      <w:start w:val="1"/>
+      <w:numFmt w:val="lowerLetter"/>
+      <w:lvlText w:val="%5."/>
+      <w:lvlJc w:val="left"/>
+      <w:pPr>
+        <w:ind w:left="3600" w:hanging="360"/>
+      </w:pPr>
+    </w:lvl>
+    <w:lvl xmlns:w="http://schemas.openxmlformats.org/wordprocessingml/2006/main" w:ilvl="5">
+      <w:start w:val="1"/>
+      <w:numFmt w:val="lowerRoman"/>
+      <w:lvlText w:val="%6."/>
+      <w:lvlJc w:val="right"/>
+      <w:pPr>
+        <w:ind w:left="4320" w:hanging="180"/>
+      </w:pPr>
+    </w:lvl>
+    <w:lvl xmlns:w="http://schemas.openxmlformats.org/wordprocessingml/2006/main" w:ilvl="6">
+      <w:start w:val="1"/>
+      <w:numFmt w:val="decimal"/>
+      <w:lvlText w:val="%7."/>
+      <w:lvlJc w:val="left"/>
+      <w:pPr>
+        <w:ind w:left="5040" w:hanging="360"/>
+      </w:pPr>
+    </w:lvl>
+    <w:lvl xmlns:w="http://schemas.openxmlformats.org/wordprocessingml/2006/main" w:ilvl="7">
+      <w:start w:val="1"/>
+      <w:numFmt w:val="lowerLetter"/>
+      <w:lvlText w:val="%8."/>
+      <w:lvlJc w:val="left"/>
+      <w:pPr>
+        <w:ind w:left="5760" w:hanging="360"/>
+      </w:pPr>
+    </w:lvl>
+    <w:lvl xmlns:w="http://schemas.openxmlformats.org/wordprocessingml/2006/main" w:ilvl="8">
+      <w:start w:val="1"/>
+      <w:numFmt w:val="lowerRoman"/>
+      <w:lvlText w:val="%9."/>
+      <w:lvlJc w:val="right"/>
+      <w:pPr>
+        <w:ind w:left="6480" w:hanging="180"/>
+      </w:pPr>
+    </w:lvl>
+  </w:abstractNum>
+  <w:num w:numId="3">
+    <w:abstractNumId w:val="3"/>
+  </w:num>
+  <w:num w:numId="2">
+    <w:abstractNumId w:val="2"/>
+  </w:num>
+  <w:num w:numId="1">
+    <w:abstractNumId w:val="1"/>
+  </w:num>
+</w:numbering>
 </file>
 
 <file path=word/styles.xml><?xml version="1.0" encoding="utf-8"?>
@@ -4284,6 +5672,18 @@
       </w:tblCellMar>
     </w:tblPr>
   </w:style>
+  <w:style w:type="paragraph" w:styleId="ListParagraph">
+    <w:uiPriority w:val="34"/>
+    <w:name w:val="List Paragraph"/>
+    <w:basedOn w:val="Normal"/>
+    <w:qFormat/>
+    <w:rsid w:val="6073B201"/>
+    <w:pPr>
+      <w:spacing/>
+      <w:ind w:left="720"/>
+      <w:contextualSpacing/>
+    </w:pPr>
+  </w:style>
 </w:styles>
 </file>
 

</xml_diff>